<commit_message>
Document existing report mechanism in code changes doc
Adds a section covering the existing reporting code: Surefire HTML
report config in pom.xml, SQLite history storage (ReportDao), and
Surefire XML parsing (TestRunner). No source code changed.

https://claude.ai/code/session_01MUeqRK1kwLVfpUcdaQ5Dvj
</commit_message>
<xml_diff>
--- a/CODE_CHANGES.docx
+++ b/CODE_CHANGES.docx
@@ -644,6 +644,508 @@
         </w:tc>
       </w:tr>
     </w:tbl>
+    <w:p/>
+    <w:p>
+      <w:r>
+        <w:rPr>
+          <w:rFonts w:ascii="Times New Roman" w:hAnsi="Times New Roman"/>
+          <w:b/>
+          <w:color w:val="006600"/>
+          <w:sz w:val="28"/>
+        </w:rPr>
+        <w:t>МЕХАНИЗМ ОТЧЁТНОСТИ (существующий)</w:t>
+      </w:r>
+    </w:p>
+    <w:p>
+      <w:r>
+        <w:rPr>
+          <w:rFonts w:ascii="Times New Roman" w:hAnsi="Times New Roman"/>
+          <w:sz w:val="16"/>
+        </w:rPr>
+        <w:t>Отчётность построена на трёх компонентах: HTML-отчёт Maven Surefire (настраивается в pom.xml), хранение истории прогонов в SQLite (ReportDao), и парсинг XML-отчётов Surefire в модель TestRunResult (TestRunner).</w:t>
+      </w:r>
+    </w:p>
+    <w:p>
+      <w:r>
+        <w:rPr>
+          <w:rFonts w:ascii="Times New Roman" w:hAnsi="Times New Roman"/>
+          <w:b/>
+          <w:color w:val="003366"/>
+          <w:sz w:val="24"/>
+        </w:rPr>
+        <w:t>1. pom.xml — Surefire HTML Report</w:t>
+      </w:r>
+    </w:p>
+    <w:p>
+      <w:r>
+        <w:rPr>
+          <w:rFonts w:ascii="Times New Roman" w:hAnsi="Times New Roman"/>
+          <w:sz w:val="16"/>
+        </w:rPr>
+        <w:t>TestGenerator.generatePom() добавляет плагин maven-surefire-report-plugin в секцию &lt;reporting&gt;. После прогона создаётся target/site/surefire-report.html.</w:t>
+      </w:r>
+    </w:p>
+    <w:p>
+      <w:pPr>
+        <w:pStyle w:val="ListBullet"/>
+      </w:pPr>
+      <w:r>
+        <w:rPr>
+          <w:rFonts w:ascii="Courier New" w:hAnsi="Courier New"/>
+          <w:color w:val="404040"/>
+          <w:sz w:val="14"/>
+        </w:rPr>
+        <w:t>&lt;reporting&gt;</w:t>
+        <w:br/>
+        <w:t xml:space="preserve">    &lt;plugins&gt;</w:t>
+        <w:br/>
+        <w:t xml:space="preserve">        &lt;plugin&gt;</w:t>
+        <w:br/>
+        <w:t xml:space="preserve">            &lt;groupId&gt;org.apache.maven.plugins&lt;/groupId&gt;</w:t>
+        <w:br/>
+        <w:t xml:space="preserve">            &lt;artifactId&gt;maven-surefire-report-plugin&lt;/artifactId&gt;</w:t>
+        <w:br/>
+        <w:t xml:space="preserve">            &lt;version&gt;3.2.2&lt;/version&gt;</w:t>
+        <w:br/>
+        <w:t xml:space="preserve">        &lt;/plugin&gt;</w:t>
+        <w:br/>
+        <w:t xml:space="preserve">    &lt;/plugins&gt;</w:t>
+        <w:br/>
+        <w:t>&lt;/reporting&gt;</w:t>
+      </w:r>
+    </w:p>
+    <w:p>
+      <w:r>
+        <w:rPr>
+          <w:rFonts w:ascii="Times New Roman" w:hAnsi="Times New Roman"/>
+          <w:b/>
+          <w:color w:val="003366"/>
+          <w:sz w:val="24"/>
+        </w:rPr>
+        <w:t>2. ReportDao.java — Хранение в SQLite</w:t>
+      </w:r>
+    </w:p>
+    <w:p>
+      <w:r>
+        <w:rPr>
+          <w:rFonts w:ascii="Times New Roman" w:hAnsi="Times New Roman"/>
+          <w:sz w:val="16"/>
+        </w:rPr>
+        <w:t>История прогонов сохраняется в локальную БД autotestgen.db. Две таблицы: test_run (сводка прогона) и test_case (детали каждого теста).</w:t>
+      </w:r>
+    </w:p>
+    <w:p>
+      <w:pPr>
+        <w:pStyle w:val="ListBullet"/>
+      </w:pPr>
+      <w:r>
+        <w:rPr>
+          <w:rFonts w:ascii="Courier New" w:hAnsi="Courier New"/>
+          <w:color w:val="404040"/>
+          <w:sz w:val="14"/>
+        </w:rPr>
+        <w:t>private void initDatabase() {</w:t>
+        <w:br/>
+        <w:t xml:space="preserve">    try (Connection conn = getConnection();</w:t>
+        <w:br/>
+        <w:t xml:space="preserve">         Statement stmt = conn.createStatement()) {</w:t>
+        <w:br/>
+        <w:t xml:space="preserve">        stmt.execute("""</w:t>
+        <w:br/>
+        <w:t xml:space="preserve">            CREATE TABLE IF NOT EXISTS test_run (</w:t>
+        <w:br/>
+        <w:t xml:space="preserve">                id          INTEGER PRIMARY KEY AUTOINCREMENT,</w:t>
+        <w:br/>
+        <w:t xml:space="preserve">                run_date    TEXT NOT NULL,</w:t>
+        <w:br/>
+        <w:t xml:space="preserve">                xml_file    TEXT NOT NULL,</w:t>
+        <w:br/>
+        <w:t xml:space="preserve">                base_url    TEXT NOT NULL,</w:t>
+        <w:br/>
+        <w:t xml:space="preserve">                total       INTEGER NOT NULL DEFAULT 0,</w:t>
+        <w:br/>
+        <w:t xml:space="preserve">                passed      INTEGER NOT NULL DEFAULT 0,</w:t>
+        <w:br/>
+        <w:t xml:space="preserve">                failed      INTEGER NOT NULL DEFAULT 0,</w:t>
+        <w:br/>
+        <w:t xml:space="preserve">                skipped     INTEGER NOT NULL DEFAULT 0,</w:t>
+        <w:br/>
+        <w:t xml:space="preserve">                duration_ms INTEGER NOT NULL DEFAULT 0</w:t>
+        <w:br/>
+        <w:t xml:space="preserve">            )""");</w:t>
+        <w:br/>
+        <w:t xml:space="preserve">        stmt.execute("""</w:t>
+        <w:br/>
+        <w:t xml:space="preserve">            CREATE TABLE IF NOT EXISTS test_case (</w:t>
+        <w:br/>
+        <w:t xml:space="preserve">                id          INTEGER PRIMARY KEY AUTOINCREMENT,</w:t>
+        <w:br/>
+        <w:t xml:space="preserve">                run_id      INTEGER NOT NULL REFERENCES test_run(id),</w:t>
+        <w:br/>
+        <w:t xml:space="preserve">                class_name  TEXT NOT NULL,</w:t>
+        <w:br/>
+        <w:t xml:space="preserve">                method_name TEXT NOT NULL,</w:t>
+        <w:br/>
+        <w:t xml:space="preserve">                passed      INTEGER NOT NULL DEFAULT 1,</w:t>
+        <w:br/>
+        <w:t xml:space="preserve">                failure_msg TEXT,</w:t>
+        <w:br/>
+        <w:t xml:space="preserve">                duration_ms INTEGER NOT NULL DEFAULT 0</w:t>
+        <w:br/>
+        <w:t xml:space="preserve">            )""");</w:t>
+        <w:br/>
+        <w:t xml:space="preserve">    } catch (SQLException e) {</w:t>
+        <w:br/>
+        <w:t xml:space="preserve">        System.err.println("Failed to init database: " + e.getMessage());</w:t>
+        <w:br/>
+        <w:t xml:space="preserve">    }</w:t>
+        <w:br/>
+        <w:t>}</w:t>
+      </w:r>
+    </w:p>
+    <w:p>
+      <w:r>
+        <w:rPr>
+          <w:rFonts w:ascii="Times New Roman" w:hAnsi="Times New Roman"/>
+          <w:sz w:val="16"/>
+        </w:rPr>
+        <w:t>saveRun() записывает прогон и все тест-кейсы в одной транзакции (batch insert).</w:t>
+      </w:r>
+    </w:p>
+    <w:p>
+      <w:pPr>
+        <w:pStyle w:val="ListBullet"/>
+      </w:pPr>
+      <w:r>
+        <w:rPr>
+          <w:rFonts w:ascii="Courier New" w:hAnsi="Courier New"/>
+          <w:color w:val="404040"/>
+          <w:sz w:val="14"/>
+        </w:rPr>
+        <w:t>public void saveRun(TestRunResult result) {</w:t>
+        <w:br/>
+        <w:t xml:space="preserve">    String sql = "INSERT INTO test_run (run_date, xml_file, base_url, " +</w:t>
+        <w:br/>
+        <w:t xml:space="preserve">        "total, passed, failed, skipped, duration_ms) VALUES (?,?,?,?,?,?,?,?)";</w:t>
+        <w:br/>
+        <w:t xml:space="preserve">    String sqlCase = "INSERT INTO test_case (run_id, class_name, " +</w:t>
+        <w:br/>
+        <w:t xml:space="preserve">        "method_name, passed, failure_msg, duration_ms) VALUES (?,?,?,?,?,?)";</w:t>
+        <w:br/>
+        <w:br/>
+        <w:t xml:space="preserve">    try (Connection conn = getConnection()) {</w:t>
+        <w:br/>
+        <w:t xml:space="preserve">        conn.setAutoCommit(false);</w:t>
+        <w:br/>
+        <w:t xml:space="preserve">        long runId;</w:t>
+        <w:br/>
+        <w:t xml:space="preserve">        try (PreparedStatement ps = conn.prepareStatement(sql,</w:t>
+        <w:br/>
+        <w:t xml:space="preserve">                Statement.RETURN_GENERATED_KEYS)) {</w:t>
+        <w:br/>
+        <w:t xml:space="preserve">            ps.setString(1, result.getRunTimestamp().format(DT_FORMAT));</w:t>
+        <w:br/>
+        <w:t xml:space="preserve">            ps.setString(2, result.getXmlFileName());</w:t>
+        <w:br/>
+        <w:t xml:space="preserve">            ps.setString(3, result.getBaseUrl());</w:t>
+        <w:br/>
+        <w:t xml:space="preserve">            ps.setInt(4, result.getTotalTests());</w:t>
+        <w:br/>
+        <w:t xml:space="preserve">            ps.setInt(5, result.getPassed());</w:t>
+        <w:br/>
+        <w:t xml:space="preserve">            ps.setInt(6, result.getFailed());</w:t>
+        <w:br/>
+        <w:t xml:space="preserve">            ps.setInt(7, result.getSkipped());</w:t>
+        <w:br/>
+        <w:t xml:space="preserve">            ps.setLong(8, result.getDurationMs());</w:t>
+        <w:br/>
+        <w:t xml:space="preserve">            ps.executeUpdate();</w:t>
+        <w:br/>
+        <w:t xml:space="preserve">            try (ResultSet rs = ps.getGeneratedKeys()) {</w:t>
+        <w:br/>
+        <w:t xml:space="preserve">                rs.next();</w:t>
+        <w:br/>
+        <w:t xml:space="preserve">                runId = rs.getLong(1);</w:t>
+        <w:br/>
+        <w:t xml:space="preserve">            }</w:t>
+        <w:br/>
+        <w:t xml:space="preserve">        }</w:t>
+        <w:br/>
+        <w:t xml:space="preserve">        try (PreparedStatement ps = conn.prepareStatement(sqlCase)) {</w:t>
+        <w:br/>
+        <w:t xml:space="preserve">            for (TestCaseResult tcr : result.getResults()) {</w:t>
+        <w:br/>
+        <w:t xml:space="preserve">                ps.setLong(1, runId);</w:t>
+        <w:br/>
+        <w:t xml:space="preserve">                ps.setString(2, tcr.getClassName());</w:t>
+        <w:br/>
+        <w:t xml:space="preserve">                ps.setString(3, tcr.getMethodName());</w:t>
+        <w:br/>
+        <w:t xml:space="preserve">                ps.setInt(4, tcr.isPassed() ? 1 : 0);</w:t>
+        <w:br/>
+        <w:t xml:space="preserve">                ps.setString(5, tcr.getFailureMessage());</w:t>
+        <w:br/>
+        <w:t xml:space="preserve">                ps.setLong(6, tcr.getDurationMs());</w:t>
+        <w:br/>
+        <w:t xml:space="preserve">                ps.addBatch();</w:t>
+        <w:br/>
+        <w:t xml:space="preserve">            }</w:t>
+        <w:br/>
+        <w:t xml:space="preserve">            ps.executeBatch();</w:t>
+        <w:br/>
+        <w:t xml:space="preserve">        }</w:t>
+        <w:br/>
+        <w:t xml:space="preserve">        conn.commit();</w:t>
+        <w:br/>
+        <w:t xml:space="preserve">    } catch (SQLException e) {</w:t>
+        <w:br/>
+        <w:t xml:space="preserve">        System.err.println("Failed to save run: " + e.getMessage());</w:t>
+        <w:br/>
+        <w:t xml:space="preserve">    }</w:t>
+        <w:br/>
+        <w:t>}</w:t>
+      </w:r>
+    </w:p>
+    <w:p>
+      <w:r>
+        <w:rPr>
+          <w:rFonts w:ascii="Times New Roman" w:hAnsi="Times New Roman"/>
+          <w:b/>
+          <w:color w:val="003366"/>
+          <w:sz w:val="24"/>
+        </w:rPr>
+        <w:t>3. TestRunner.java — Парсинг Surefire XML</w:t>
+      </w:r>
+    </w:p>
+    <w:p>
+      <w:r>
+        <w:rPr>
+          <w:rFonts w:ascii="Times New Roman" w:hAnsi="Times New Roman"/>
+          <w:sz w:val="16"/>
+        </w:rPr>
+        <w:t>После прогона mvn test парсит target/surefire-reports/*.xml через StAX, собирая статусы каждого теста (passed/failed/skipped) в TestRunResult.</w:t>
+      </w:r>
+    </w:p>
+    <w:p>
+      <w:pPr>
+        <w:pStyle w:val="ListBullet"/>
+      </w:pPr>
+      <w:r>
+        <w:rPr>
+          <w:rFonts w:ascii="Courier New" w:hAnsi="Courier New"/>
+          <w:color w:val="404040"/>
+          <w:sz w:val="14"/>
+        </w:rPr>
+        <w:t>private void parseSurefireReports(Path reportsDir, TestRunResult runResult)</w:t>
+        <w:br/>
+        <w:t xml:space="preserve">        throws IOException {</w:t>
+        <w:br/>
+        <w:t xml:space="preserve">    List&lt;TestCaseResult&gt; allResults = new ArrayList&lt;&gt;();</w:t>
+        <w:br/>
+        <w:br/>
+        <w:t xml:space="preserve">    try (var stream = Files.list(reportsDir)) {</w:t>
+        <w:br/>
+        <w:t xml:space="preserve">        List&lt;Path&gt; xmlFiles = stream</w:t>
+        <w:br/>
+        <w:t xml:space="preserve">                .filter(p -&gt; p.toString().endsWith(".xml")).toList();</w:t>
+        <w:br/>
+        <w:t xml:space="preserve">        XMLInputFactory factory = XMLInputFactory.newInstance();</w:t>
+        <w:br/>
+        <w:br/>
+        <w:t xml:space="preserve">        for (Path xmlFile : xmlFiles) {</w:t>
+        <w:br/>
+        <w:t xml:space="preserve">            try (InputStream is = Files.newInputStream(xmlFile)) {</w:t>
+        <w:br/>
+        <w:t xml:space="preserve">                XMLStreamReader reader = factory.createXMLStreamReader(is);</w:t>
+        <w:br/>
+        <w:t xml:space="preserve">                while (reader.hasNext()) {</w:t>
+        <w:br/>
+        <w:t xml:space="preserve">                    int event = reader.next();</w:t>
+        <w:br/>
+        <w:t xml:space="preserve">                    if (event == XMLStreamConstants.START_ELEMENT</w:t>
+        <w:br/>
+        <w:t xml:space="preserve">                            &amp;&amp; "testcase".equals(reader.getLocalName())) {</w:t>
+        <w:br/>
+        <w:t xml:space="preserve">                        TestCaseResult tcr = new TestCaseResult();</w:t>
+        <w:br/>
+        <w:t xml:space="preserve">                        tcr.setClassName(reader.getAttributeValue(null, "classname"));</w:t>
+        <w:br/>
+        <w:t xml:space="preserve">                        tcr.setMethodName(reader.getAttributeValue(null, "name"));</w:t>
+        <w:br/>
+        <w:t xml:space="preserve">                        tcr.setDurationMs((long)(parseDoubleAttr(reader,"time")*1000));</w:t>
+        <w:br/>
+        <w:t xml:space="preserve">                        tcr.setPassed(true);</w:t>
+        <w:br/>
+        <w:t xml:space="preserve">                        // Сканируем дочерние до &lt;/testcase&gt;</w:t>
+        <w:br/>
+        <w:t xml:space="preserve">                        while (reader.hasNext()) {</w:t>
+        <w:br/>
+        <w:t xml:space="preserve">                            event = reader.next();</w:t>
+        <w:br/>
+        <w:t xml:space="preserve">                            if (event == XMLStreamConstants.END_ELEMENT</w:t>
+        <w:br/>
+        <w:t xml:space="preserve">                                    &amp;&amp; "testcase".equals(reader.getLocalName())) break;</w:t>
+        <w:br/>
+        <w:t xml:space="preserve">                            if (event == XMLStreamConstants.START_ELEMENT) {</w:t>
+        <w:br/>
+        <w:t xml:space="preserve">                                String c = reader.getLocalName();</w:t>
+        <w:br/>
+        <w:t xml:space="preserve">                                if ("failure".equals(c) || "error".equals(c)) {</w:t>
+        <w:br/>
+        <w:t xml:space="preserve">                                    tcr.setPassed(false);</w:t>
+        <w:br/>
+        <w:t xml:space="preserve">                                    tcr.setFailureMessage(</w:t>
+        <w:br/>
+        <w:t xml:space="preserve">                                        reader.getAttributeValue(null,"message"));</w:t>
+        <w:br/>
+        <w:t xml:space="preserve">                                } else if ("skipped".equals(c)) {</w:t>
+        <w:br/>
+        <w:t xml:space="preserve">                                    tcr.setPassed(false);</w:t>
+        <w:br/>
+        <w:t xml:space="preserve">                                    tcr.setSkipped(true);</w:t>
+        <w:br/>
+        <w:t xml:space="preserve">                                    tcr.setFailureMessage(cleanSkipMessage(</w:t>
+        <w:br/>
+        <w:t xml:space="preserve">                                        reader.getAttributeValue(null,"message")));</w:t>
+        <w:br/>
+        <w:t xml:space="preserve">                                }</w:t>
+        <w:br/>
+        <w:t xml:space="preserve">                            }</w:t>
+        <w:br/>
+        <w:t xml:space="preserve">                        }</w:t>
+        <w:br/>
+        <w:t xml:space="preserve">                        allResults.add(tcr);</w:t>
+        <w:br/>
+        <w:t xml:space="preserve">                    }</w:t>
+        <w:br/>
+        <w:t xml:space="preserve">                }</w:t>
+        <w:br/>
+        <w:t xml:space="preserve">                reader.close();</w:t>
+        <w:br/>
+        <w:t xml:space="preserve">            } catch (Exception e) {</w:t>
+        <w:br/>
+        <w:t xml:space="preserve">                System.err.println("Error parsing " + xmlFile + ": " + e.getMessage());</w:t>
+        <w:br/>
+        <w:t xml:space="preserve">            }</w:t>
+        <w:br/>
+        <w:t xml:space="preserve">        }</w:t>
+        <w:br/>
+        <w:t xml:space="preserve">    }</w:t>
+        <w:br/>
+        <w:t xml:space="preserve">    // Считаем из реальных результатов (надёжнее testsuite-атрибутов)</w:t>
+        <w:br/>
+        <w:t xml:space="preserve">    int passed = 0, failed = 0, skipped = 0;</w:t>
+        <w:br/>
+        <w:t xml:space="preserve">    for (TestCaseResult tcr : allResults) {</w:t>
+        <w:br/>
+        <w:t xml:space="preserve">        if (tcr.isSkipped()) skipped++;</w:t>
+        <w:br/>
+        <w:t xml:space="preserve">        else if (tcr.isPassed()) passed++;</w:t>
+        <w:br/>
+        <w:t xml:space="preserve">        else failed++;</w:t>
+        <w:br/>
+        <w:t xml:space="preserve">    }</w:t>
+        <w:br/>
+        <w:t xml:space="preserve">    runResult.setTotalTests(allResults.size());</w:t>
+        <w:br/>
+        <w:t xml:space="preserve">    runResult.setPassed(passed);</w:t>
+        <w:br/>
+        <w:t xml:space="preserve">    runResult.setFailed(failed);</w:t>
+        <w:br/>
+        <w:t xml:space="preserve">    runResult.setSkipped(skipped);</w:t>
+        <w:br/>
+        <w:t xml:space="preserve">    runResult.setResults(allResults);</w:t>
+        <w:br/>
+        <w:t>}</w:t>
+      </w:r>
+    </w:p>
+    <w:p>
+      <w:r>
+        <w:rPr>
+          <w:rFonts w:ascii="Times New Roman" w:hAnsi="Times New Roman"/>
+          <w:sz w:val="16"/>
+        </w:rPr>
+        <w:t>cleanSkipMessage() убирает технический префикс JUnit Assumption, оставляя человекочитаемую причину пропуска для отчёта.</w:t>
+      </w:r>
+    </w:p>
+    <w:p>
+      <w:pPr>
+        <w:pStyle w:val="ListBullet"/>
+      </w:pPr>
+      <w:r>
+        <w:rPr>
+          <w:rFonts w:ascii="Courier New" w:hAnsi="Courier New"/>
+          <w:color w:val="404040"/>
+          <w:sz w:val="14"/>
+        </w:rPr>
+        <w:t>private String cleanSkipMessage(String raw) {</w:t>
+        <w:br/>
+        <w:t xml:space="preserve">    if (raw == null || raw.isEmpty()) return "SKIPPED";</w:t>
+        <w:br/>
+        <w:t xml:space="preserve">    String msg = raw.trim();</w:t>
+        <w:br/>
+        <w:t xml:space="preserve">    msg = msg.replaceFirst(</w:t>
+        <w:br/>
+        <w:t xml:space="preserve">        "^org\\.opentest4j\\.TestAbortedException:\\s*", "");</w:t>
+        <w:br/>
+        <w:t xml:space="preserve">    msg = msg.replaceFirst("^Assumption failed:\\s*", "");</w:t>
+        <w:br/>
+        <w:t xml:space="preserve">    return msg.isEmpty() ? "SKIPPED" : msg;</w:t>
+        <w:br/>
+        <w:t>}</w:t>
+      </w:r>
+    </w:p>
+    <w:p>
+      <w:r>
+        <w:rPr>
+          <w:rFonts w:ascii="Times New Roman" w:hAnsi="Times New Roman"/>
+          <w:b/>
+          <w:color w:val="003366"/>
+          <w:sz w:val="24"/>
+        </w:rPr>
+        <w:t>4. MainController.java — Вывод ссылки на отчёт</w:t>
+      </w:r>
+    </w:p>
+    <w:p>
+      <w:r>
+        <w:rPr>
+          <w:rFonts w:ascii="Times New Roman" w:hAnsi="Times New Roman"/>
+          <w:sz w:val="16"/>
+        </w:rPr>
+        <w:t>После успешного прогона результат сохраняется в БД (reportDao.saveRun) и в лог выводится путь к HTML-отчёту Surefire.</w:t>
+      </w:r>
+    </w:p>
+    <w:p>
+      <w:pPr>
+        <w:pStyle w:val="ListBullet"/>
+      </w:pPr>
+      <w:r>
+        <w:rPr>
+          <w:rFonts w:ascii="Courier New" w:hAnsi="Courier New"/>
+          <w:color w:val="404040"/>
+          <w:sz w:val="14"/>
+        </w:rPr>
+        <w:t>task.setOnSucceeded(event -&gt; {</w:t>
+        <w:br/>
+        <w:t xml:space="preserve">    TestRunResult result = task.getValue();</w:t>
+        <w:br/>
+        <w:t xml:space="preserve">    displayResults(result);</w:t>
+        <w:br/>
+        <w:t xml:space="preserve">    reportDao.saveRun(result);</w:t>
+        <w:br/>
+        <w:t xml:space="preserve">    log("Тесты завершены. Всего: " + result.getTotalTests()</w:t>
+        <w:br/>
+        <w:t xml:space="preserve">        + ", Успешно: " + result.getPassed()</w:t>
+        <w:br/>
+        <w:t xml:space="preserve">        + ", Ошибки: " + result.getFailed());</w:t>
+        <w:br/>
+        <w:t xml:space="preserve">    log("HTML-отчёт: " + outputPath + "/target/site/surefire-report.html");</w:t>
+        <w:br/>
+        <w:t xml:space="preserve">    log("Скриншоты: " + outputPath + "/target/screenshots/");</w:t>
+        <w:br/>
+        <w:t>});</w:t>
+      </w:r>
+    </w:p>
     <w:sectPr>
       <w:pgSz w:w="12240" w:h="15840"/>
       <w:pgMar w:top="720" w:right="720" w:bottom="720" w:left="720" w:header="720" w:footer="720" w:gutter="0"/>

</xml_diff>